<commit_message>
up: atualiza para v30 e novo modelo.docx
</commit_message>
<xml_diff>
--- a/modelo.docx
+++ b/modelo.docx
@@ -90,7 +90,7 @@
           <w:b/>
           <w:noProof/>
         </w:rPr>
-        <w:t>22/06/2026</w:t>
+        <w:t>25/06/2026</w:t>
       </w:r>
       <w:r>
         <w:rPr>
@@ -267,12 +267,6 @@
                 <w:rFonts w:ascii="Verdana" w:hAnsi="Verdana"/>
               </w:rPr>
             </w:pPr>
-            <w:r>
-              <w:rPr>
-                <w:rFonts w:ascii="Verdana" w:hAnsi="Verdana"/>
-              </w:rPr>
-              <w:t>[Espaço para preencher]</w:t>
-            </w:r>
           </w:p>
         </w:tc>
       </w:tr>
@@ -353,12 +347,6 @@
                 <w:rFonts w:ascii="Verdana" w:hAnsi="Verdana"/>
               </w:rPr>
             </w:pPr>
-            <w:r>
-              <w:rPr>
-                <w:rFonts w:ascii="Verdana" w:hAnsi="Verdana"/>
-              </w:rPr>
-              <w:t>[Espaço para preencher]</w:t>
-            </w:r>
           </w:p>
         </w:tc>
       </w:tr>
@@ -439,12 +427,6 @@
                 <w:rFonts w:ascii="Verdana" w:hAnsi="Verdana"/>
               </w:rPr>
             </w:pPr>
-            <w:r>
-              <w:rPr>
-                <w:rFonts w:ascii="Verdana" w:hAnsi="Verdana"/>
-              </w:rPr>
-              <w:t>[Espaço para preencher]</w:t>
-            </w:r>
           </w:p>
         </w:tc>
       </w:tr>
@@ -525,12 +507,6 @@
                 <w:rFonts w:ascii="Verdana" w:hAnsi="Verdana"/>
               </w:rPr>
             </w:pPr>
-            <w:r>
-              <w:rPr>
-                <w:rFonts w:ascii="Verdana" w:hAnsi="Verdana"/>
-              </w:rPr>
-              <w:t>[Espaço para preencher]</w:t>
-            </w:r>
           </w:p>
         </w:tc>
       </w:tr>
@@ -1274,9 +1250,9 @@
                 <w:sz w:val="24"/>
                 <w:szCs w:val="24"/>
               </w:rPr>
-              <w:t>F_Peso</w:t>
-            </w:r>
-            <w:proofErr w:type="gramStart"/>
+              <w:t>F_Peso_Habitual</w:t>
+            </w:r>
+            <w:proofErr w:type="spellEnd"/>
             <w:r>
               <w:rPr>
                 <w:rFonts w:eastAsiaTheme="minorEastAsia" w:cstheme="minorHAnsi"/>
@@ -1284,35 +1260,33 @@
                 <w:sz w:val="24"/>
                 <w:szCs w:val="24"/>
               </w:rPr>
-              <w:t>_Habitual</w:t>
-            </w:r>
-            <w:proofErr w:type="spellEnd"/>
-            <w:proofErr w:type="gramEnd"/>
-            <w:r>
-              <w:rPr>
-                <w:rFonts w:eastAsiaTheme="minorEastAsia" w:cstheme="minorHAnsi"/>
+              <w:t>-(referido)}}</w:t>
+            </w:r>
+          </w:p>
+        </w:tc>
+      </w:tr>
+      <w:tr>
+        <w:tc>
+          <w:tcPr>
+            <w:cnfStyle w:val="001000000000" w:firstRow="0" w:lastRow="0" w:firstColumn="1" w:lastColumn="0" w:oddVBand="0" w:evenVBand="0" w:oddHBand="0" w:evenHBand="0" w:firstRowFirstColumn="0" w:firstRowLastColumn="0" w:lastRowFirstColumn="0" w:lastRowLastColumn="0"/>
+            <w:tcW w:w="1849" w:type="pct"/>
+            <w:tcBorders>
+              <w:right w:val="single" w:sz="18" w:space="0" w:color="5B9BD5" w:themeColor="accent1"/>
+            </w:tcBorders>
+            <w:noWrap/>
+          </w:tcPr>
+          <w:p>
+            <w:pPr>
+              <w:jc w:val="left"/>
+              <w:rPr>
+                <w:rFonts w:asciiTheme="minorHAnsi" w:eastAsiaTheme="minorEastAsia" w:hAnsiTheme="minorHAnsi" w:cstheme="minorHAnsi"/>
+                <w:i w:val="0"/>
                 <w:color w:val="auto"/>
                 <w:sz w:val="24"/>
                 <w:szCs w:val="24"/>
               </w:rPr>
-              <w:t>-(referido)}}</w:t>
-            </w:r>
-          </w:p>
-        </w:tc>
-      </w:tr>
-      <w:tr>
-        <w:tc>
-          <w:tcPr>
-            <w:cnfStyle w:val="001000000000" w:firstRow="0" w:lastRow="0" w:firstColumn="1" w:lastColumn="0" w:oddVBand="0" w:evenVBand="0" w:oddHBand="0" w:evenHBand="0" w:firstRowFirstColumn="0" w:firstRowLastColumn="0" w:lastRowFirstColumn="0" w:lastRowLastColumn="0"/>
-            <w:tcW w:w="1849" w:type="pct"/>
-            <w:tcBorders>
-              <w:right w:val="single" w:sz="18" w:space="0" w:color="5B9BD5" w:themeColor="accent1"/>
-            </w:tcBorders>
-            <w:noWrap/>
-          </w:tcPr>
-          <w:p>
-            <w:pPr>
-              <w:jc w:val="left"/>
+            </w:pPr>
+            <w:r>
               <w:rPr>
                 <w:rFonts w:asciiTheme="minorHAnsi" w:eastAsiaTheme="minorEastAsia" w:hAnsiTheme="minorHAnsi" w:cstheme="minorHAnsi"/>
                 <w:i w:val="0"/>
@@ -1320,38 +1294,39 @@
                 <w:sz w:val="24"/>
                 <w:szCs w:val="24"/>
               </w:rPr>
-            </w:pPr>
-            <w:r>
-              <w:rPr>
-                <w:rFonts w:asciiTheme="minorHAnsi" w:eastAsiaTheme="minorEastAsia" w:hAnsiTheme="minorHAnsi" w:cstheme="minorHAnsi"/>
-                <w:i w:val="0"/>
+              <w:t>Peso Atual (aferido)</w:t>
+            </w:r>
+          </w:p>
+        </w:tc>
+        <w:tc>
+          <w:tcPr>
+            <w:tcW w:w="3151" w:type="pct"/>
+            <w:gridSpan w:val="5"/>
+            <w:tcBorders>
+              <w:left w:val="single" w:sz="18" w:space="0" w:color="5B9BD5" w:themeColor="accent1"/>
+            </w:tcBorders>
+          </w:tcPr>
+          <w:p>
+            <w:pPr>
+              <w:jc w:val="both"/>
+              <w:cnfStyle w:val="000000000000" w:firstRow="0" w:lastRow="0" w:firstColumn="0" w:lastColumn="0" w:oddVBand="0" w:evenVBand="0" w:oddHBand="0" w:evenHBand="0" w:firstRowFirstColumn="0" w:firstRowLastColumn="0" w:lastRowFirstColumn="0" w:lastRowLastColumn="0"/>
+              <w:rPr>
+                <w:rFonts w:eastAsiaTheme="minorEastAsia" w:cstheme="minorHAnsi"/>
                 <w:color w:val="auto"/>
                 <w:sz w:val="24"/>
                 <w:szCs w:val="24"/>
               </w:rPr>
-              <w:t>Peso Atual (aferido)</w:t>
-            </w:r>
-          </w:p>
-        </w:tc>
-        <w:tc>
-          <w:tcPr>
-            <w:tcW w:w="3151" w:type="pct"/>
-            <w:gridSpan w:val="5"/>
-            <w:tcBorders>
-              <w:left w:val="single" w:sz="18" w:space="0" w:color="5B9BD5" w:themeColor="accent1"/>
-            </w:tcBorders>
-          </w:tcPr>
-          <w:p>
-            <w:pPr>
-              <w:jc w:val="both"/>
-              <w:cnfStyle w:val="000000000000" w:firstRow="0" w:lastRow="0" w:firstColumn="0" w:lastColumn="0" w:oddVBand="0" w:evenVBand="0" w:oddHBand="0" w:evenHBand="0" w:firstRowFirstColumn="0" w:firstRowLastColumn="0" w:lastRowFirstColumn="0" w:lastRowLastColumn="0"/>
+            </w:pPr>
+            <w:r>
               <w:rPr>
                 <w:rFonts w:eastAsiaTheme="minorEastAsia" w:cstheme="minorHAnsi"/>
                 <w:color w:val="auto"/>
                 <w:sz w:val="24"/>
                 <w:szCs w:val="24"/>
               </w:rPr>
-            </w:pPr>
+              <w:t>{{</w:t>
+            </w:r>
+            <w:proofErr w:type="spellStart"/>
             <w:r>
               <w:rPr>
                 <w:rFonts w:eastAsiaTheme="minorEastAsia" w:cstheme="minorHAnsi"/>
@@ -1359,30 +1334,9 @@
                 <w:sz w:val="24"/>
                 <w:szCs w:val="24"/>
               </w:rPr>
-              <w:t>{{</w:t>
-            </w:r>
-            <w:proofErr w:type="spellStart"/>
-            <w:r>
-              <w:rPr>
-                <w:rFonts w:eastAsiaTheme="minorEastAsia" w:cstheme="minorHAnsi"/>
-                <w:color w:val="auto"/>
-                <w:sz w:val="24"/>
-                <w:szCs w:val="24"/>
-              </w:rPr>
-              <w:t>F_Peso</w:t>
-            </w:r>
-            <w:proofErr w:type="gramStart"/>
-            <w:r>
-              <w:rPr>
-                <w:rFonts w:eastAsiaTheme="minorEastAsia" w:cstheme="minorHAnsi"/>
-                <w:color w:val="auto"/>
-                <w:sz w:val="24"/>
-                <w:szCs w:val="24"/>
-              </w:rPr>
-              <w:t>_Atual</w:t>
+              <w:t>F_Peso_Atual</w:t>
             </w:r>
             <w:proofErr w:type="spellEnd"/>
-            <w:proofErr w:type="gramEnd"/>
             <w:r>
               <w:rPr>
                 <w:rFonts w:eastAsiaTheme="minorEastAsia" w:cstheme="minorHAnsi"/>
@@ -2357,21 +2311,12 @@
               <w:t>F_IMC_Est_Adulto</w:t>
             </w:r>
             <w:proofErr w:type="spellEnd"/>
-            <w:proofErr w:type="gramStart"/>
-            <w:r>
-              <w:rPr>
-                <w:rFonts w:eastAsiaTheme="minorEastAsia"/>
-                <w:color w:val="auto"/>
-              </w:rPr>
-              <w:t>}}{</w:t>
-            </w:r>
-            <w:proofErr w:type="gramEnd"/>
-            <w:r>
-              <w:rPr>
-                <w:rFonts w:eastAsiaTheme="minorEastAsia"/>
-                <w:color w:val="auto"/>
-              </w:rPr>
-              <w:t>{</w:t>
+            <w:r>
+              <w:rPr>
+                <w:rFonts w:eastAsiaTheme="minorEastAsia"/>
+                <w:color w:val="auto"/>
+              </w:rPr>
+              <w:t>}}{{</w:t>
             </w:r>
             <w:proofErr w:type="spellStart"/>
             <w:r>
@@ -3537,23 +3482,7 @@
                 <w:rFonts w:eastAsiaTheme="minorEastAsia"/>
                 <w:color w:val="auto"/>
               </w:rPr>
-              <w:t>{{F_Proteina</w:t>
-            </w:r>
-            <w:proofErr w:type="gramStart"/>
-            <w:r>
-              <w:rPr>
-                <w:rFonts w:eastAsiaTheme="minorEastAsia"/>
-                <w:color w:val="auto"/>
-              </w:rPr>
-              <w:t>_Recomenda</w:t>
-            </w:r>
-            <w:proofErr w:type="gramEnd"/>
-            <w:r>
-              <w:rPr>
-                <w:rFonts w:eastAsiaTheme="minorEastAsia"/>
-                <w:color w:val="auto"/>
-              </w:rPr>
-              <w:t>_g-kg-dia01}}</w:t>
+              <w:t>{{F_Proteina_Recomenda_g-kg-dia01}}</w:t>
             </w:r>
             <w:r>
               <w:rPr>
@@ -4605,12 +4534,6 @@
                 <w:rFonts w:ascii="Verdana" w:hAnsi="Verdana"/>
               </w:rPr>
             </w:pPr>
-            <w:r>
-              <w:rPr>
-                <w:rFonts w:ascii="Verdana" w:hAnsi="Verdana"/>
-              </w:rPr>
-              <w:t>[Espaço para preencher]</w:t>
-            </w:r>
           </w:p>
         </w:tc>
       </w:tr>
@@ -4759,12 +4682,6 @@
                 <w:rFonts w:ascii="Verdana" w:hAnsi="Verdana"/>
               </w:rPr>
             </w:pPr>
-            <w:r>
-              <w:rPr>
-                <w:rFonts w:ascii="Verdana" w:hAnsi="Verdana"/>
-              </w:rPr>
-              <w:t>[Espaço para preencher]</w:t>
-            </w:r>
           </w:p>
         </w:tc>
       </w:tr>
@@ -4913,12 +4830,6 @@
                 <w:rFonts w:ascii="Verdana" w:hAnsi="Verdana"/>
               </w:rPr>
             </w:pPr>
-            <w:r>
-              <w:rPr>
-                <w:rFonts w:ascii="Verdana" w:hAnsi="Verdana"/>
-              </w:rPr>
-              <w:t>[Espaço para preencher]</w:t>
-            </w:r>
           </w:p>
         </w:tc>
       </w:tr>

</xml_diff>